<commit_message>
docs: ecology 2025 docs updated — period 19.03-31.07.2026
</commit_message>
<xml_diff>
--- a/docs/экология_2025/Аныктама_кыргызча.docx
+++ b/docs/экология_2025/Аныктама_кыргызча.docx
@@ -49,8 +49,184 @@
       </w:r>
     </w:p>
     <w:p>
+      <w:proofErr w:type="spellStart"/>
       <w:r>
-        <w:t>ОсОО «АйБиКон» филиалы КРде 2025-жылдын 1-январынан 31-декабрына чейинки мезгил үчүн айлана-чөйрөнү коргоо боюнча баштапкы маалыматтарды берет:</w:t>
+        <w:rPr>
+          <w:lang w:val="ru-RU"/>
+        </w:rPr>
+        <w:t>КРдеги</w:t>
+      </w:r>
+      <w:proofErr w:type="spellEnd"/>
+      <w:r>
+        <w:t xml:space="preserve"> </w:t>
+      </w:r>
+      <w:r>
+        <w:rPr>
+          <w:lang w:val="ru-RU"/>
+        </w:rPr>
+        <w:t>ОсОО</w:t>
+      </w:r>
+      <w:r>
+        <w:t xml:space="preserve"> «</w:t>
+      </w:r>
+      <w:r>
+        <w:rPr>
+          <w:lang w:val="ru-RU"/>
+        </w:rPr>
+        <w:t>АйБиКон</w:t>
+      </w:r>
+      <w:r>
+        <w:t xml:space="preserve">» </w:t>
+      </w:r>
+      <w:r>
+        <w:rPr>
+          <w:lang w:val="ru-RU"/>
+        </w:rPr>
+        <w:t>филиалы</w:t>
+      </w:r>
+      <w:r>
+        <w:t xml:space="preserve"> 2026-</w:t>
+      </w:r>
+      <w:proofErr w:type="spellStart"/>
+      <w:r>
+        <w:rPr>
+          <w:lang w:val="ru-RU"/>
+        </w:rPr>
+        <w:t>жылдын</w:t>
+      </w:r>
+      <w:proofErr w:type="spellEnd"/>
+      <w:r>
+        <w:t xml:space="preserve"> 19-</w:t>
+      </w:r>
+      <w:proofErr w:type="spellStart"/>
+      <w:r>
+        <w:rPr>
+          <w:lang w:val="ru-RU"/>
+        </w:rPr>
+        <w:t>мартынан</w:t>
+      </w:r>
+      <w:proofErr w:type="spellEnd"/>
+      <w:r>
+        <w:t xml:space="preserve"> 31-</w:t>
+      </w:r>
+      <w:proofErr w:type="spellStart"/>
+      <w:r>
+        <w:rPr>
+          <w:lang w:val="ru-RU"/>
+        </w:rPr>
+        <w:t>июлуна</w:t>
+      </w:r>
+      <w:proofErr w:type="spellEnd"/>
+      <w:r>
+        <w:t xml:space="preserve"> </w:t>
+      </w:r>
+      <w:proofErr w:type="spellStart"/>
+      <w:r>
+        <w:rPr>
+          <w:lang w:val="ru-RU"/>
+        </w:rPr>
+        <w:t>чейинки</w:t>
+      </w:r>
+      <w:proofErr w:type="spellEnd"/>
+      <w:r>
+        <w:t xml:space="preserve"> </w:t>
+      </w:r>
+      <w:proofErr w:type="spellStart"/>
+      <w:r>
+        <w:rPr>
+          <w:lang w:val="ru-RU"/>
+        </w:rPr>
+        <w:t>мезгил</w:t>
+      </w:r>
+      <w:proofErr w:type="spellEnd"/>
+      <w:r>
+        <w:t xml:space="preserve"> </w:t>
+      </w:r>
+      <w:proofErr w:type="spellStart"/>
+      <w:r>
+        <w:rPr>
+          <w:lang w:val="ru-RU"/>
+        </w:rPr>
+        <w:t>үчүн</w:t>
+      </w:r>
+      <w:proofErr w:type="spellEnd"/>
+      <w:r>
+        <w:t xml:space="preserve"> </w:t>
+      </w:r>
+      <w:proofErr w:type="spellStart"/>
+      <w:r>
+        <w:rPr>
+          <w:lang w:val="ru-RU"/>
+        </w:rPr>
+        <w:t>айлана</w:t>
+      </w:r>
+      <w:proofErr w:type="spellEnd"/>
+      <w:r>
+        <w:t>-</w:t>
+      </w:r>
+      <w:proofErr w:type="spellStart"/>
+      <w:r>
+        <w:rPr>
+          <w:lang w:val="ru-RU"/>
+        </w:rPr>
+        <w:t>чөйрөнү</w:t>
+      </w:r>
+      <w:proofErr w:type="spellEnd"/>
+      <w:r>
+        <w:t xml:space="preserve"> </w:t>
+      </w:r>
+      <w:proofErr w:type="spellStart"/>
+      <w:r>
+        <w:rPr>
+          <w:lang w:val="ru-RU"/>
+        </w:rPr>
+        <w:t>коргоо</w:t>
+      </w:r>
+      <w:proofErr w:type="spellEnd"/>
+      <w:r>
+        <w:t xml:space="preserve"> </w:t>
+      </w:r>
+      <w:proofErr w:type="spellStart"/>
+      <w:r>
+        <w:rPr>
+          <w:lang w:val="ru-RU"/>
+        </w:rPr>
+        <w:t>боюнча</w:t>
+      </w:r>
+      <w:proofErr w:type="spellEnd"/>
+      <w:r>
+        <w:t xml:space="preserve"> </w:t>
+      </w:r>
+      <w:proofErr w:type="spellStart"/>
+      <w:r>
+        <w:rPr>
+          <w:lang w:val="ru-RU"/>
+        </w:rPr>
+        <w:t>баштапкы</w:t>
+      </w:r>
+      <w:proofErr w:type="spellEnd"/>
+      <w:r>
+        <w:t xml:space="preserve"> </w:t>
+      </w:r>
+      <w:proofErr w:type="spellStart"/>
+      <w:r>
+        <w:rPr>
+          <w:lang w:val="ru-RU"/>
+        </w:rPr>
+        <w:t>маалыматтарды</w:t>
+      </w:r>
+      <w:proofErr w:type="spellEnd"/>
+      <w:r>
+        <w:t xml:space="preserve"> </w:t>
+      </w:r>
+      <w:r>
+        <w:rPr>
+          <w:lang w:val="ru-RU"/>
+        </w:rPr>
+        <w:t>берет</w:t>
+      </w:r>
+      <w:r>
+        <w:t>:</w:t>
       </w:r>
     </w:p>
     <w:tbl>
@@ -104,14 +280,7 @@
                 <w:b/>
                 <w:sz w:val="18"/>
               </w:rPr>
-              <w:t>Өлчөм</w:t>
-            </w:r>
-            <w:r>
-              <w:rPr>
-                <w:b/>
-                <w:sz w:val="18"/>
-              </w:rPr>
-              <w:t xml:space="preserve"> бирдиги</w:t>
+              <w:t>Өлчөм бирдиги</w:t>
             </w:r>
           </w:p>
         </w:tc>
@@ -801,13 +970,7 @@
               <w:rPr>
                 <w:sz w:val="16"/>
               </w:rPr>
-              <w:t>Өндүрүштүк</w:t>
-            </w:r>
-            <w:r>
-              <w:rPr>
-                <w:sz w:val="16"/>
-              </w:rPr>
-              <w:t xml:space="preserve"> калдыктар</w:t>
+              <w:t>Өндүрүштүк калдыктар</w:t>
             </w:r>
           </w:p>
         </w:tc>
@@ -2047,7 +2210,6 @@
   <w:style w:type="character" w:default="1" w:styleId="a2">
     <w:name w:val="Default Paragraph Font"/>
     <w:uiPriority w:val="1"/>
-    <w:semiHidden/>
     <w:unhideWhenUsed/>
   </w:style>
   <w:style w:type="table" w:default="1" w:styleId="a3">

</xml_diff>